<commit_message>
added prompt specification and edits
</commit_message>
<xml_diff>
--- a/docs/requirements/user-stores.docx
+++ b/docs/requirements/user-stores.docx
@@ -1,13 +1,12 @@
 
 <file path=word/document.xml><?xml version="1.0" encoding="utf-8"?>
-<w:document xmlns:wpc="http://schemas.microsoft.com/office/word/2010/wordprocessingCanvas" xmlns:cx="http://schemas.microsoft.com/office/drawing/2014/chartex" xmlns:cx1="http://schemas.microsoft.com/office/drawing/2015/9/8/chartex" xmlns:cx2="http://schemas.microsoft.com/office/drawing/2015/10/21/chartex" xmlns:cx3="http://schemas.microsoft.com/office/drawing/2016/5/9/chartex" xmlns:cx4="http://schemas.microsoft.com/office/drawing/2016/5/10/chartex" xmlns:cx5="http://schemas.microsoft.com/office/drawing/2016/5/11/chartex" xmlns:cx6="http://schemas.microsoft.com/office/drawing/2016/5/12/chartex" xmlns:cx7="http://schemas.microsoft.com/office/drawing/2016/5/13/chartex" xmlns:cx8="http://schemas.microsoft.com/office/drawing/2016/5/14/chartex" xmlns:mc="http://schemas.openxmlformats.org/markup-compatibility/2006" xmlns:m="http://schemas.openxmlformats.org/officeDocument/2006/math" xmlns:aink="http://schemas.microsoft.com/office/drawing/2016/ink" xmlns:am3d="http://schemas.microsoft.com/office/drawing/2017/model3d" xmlns:oel="http://schemas.microsoft.com/office/2019/extlst" xmlns:r="http://schemas.openxmlformats.org/officeDocument/2006/relationships" xmlns:wp14="http://schemas.microsoft.com/office/word/2010/wordprocessingDrawing" xmlns:wp="http://schemas.openxmlformats.org/drawingml/2006/wordprocessingDrawing" xmlns:wpg="http://schemas.microsoft.com/office/word/2010/wordprocessingGroup" xmlns:wpi="http://schemas.microsoft.com/office/word/2010/wordprocessingInk" xmlns:wps="http://schemas.microsoft.com/office/word/2010/wordprocessingShape" xmlns:o="urn:schemas-microsoft-com:office:office" xmlns:v="urn:schemas-microsoft-com:vml" xmlns:w10="urn:schemas-microsoft-com:office:word" xmlns:w="http://schemas.openxmlformats.org/wordprocessingml/2006/main" xmlns:w14="http://schemas.microsoft.com/office/word/2010/wordml" xmlns:w15="http://schemas.microsoft.com/office/word/2012/wordml" xmlns:w16cex="http://schemas.microsoft.com/office/word/2018/wordml/cex" xmlns:w16cid="http://schemas.microsoft.com/office/word/2016/wordml/cid" xmlns:w16="http://schemas.microsoft.com/office/word/2018/wordml" xmlns:w16sdtdh="http://schemas.microsoft.com/office/word/2020/wordml/sdtdatahash" xmlns:w16sdtfl="http://schemas.microsoft.com/office/word/2024/wordml/sdtformatlock" xmlns:w16se="http://schemas.microsoft.com/office/word/2015/wordml/symex" xmlns:w16du="http://schemas.microsoft.com/office/word/2023/wordml/word16du" xmlns:wne="http://schemas.microsoft.com/office/word/2006/wordml" mc:Ignorable="w14 w15 w16se w16cid w16 w16cex w16sdtdh w16sdtfl w16du wp14">
+<w:document xmlns:wpc="http://schemas.microsoft.com/office/word/2010/wordprocessingCanvas" xmlns:cx="http://schemas.microsoft.com/office/drawing/2014/chartex" xmlns:cx1="http://schemas.microsoft.com/office/drawing/2015/9/8/chartex" xmlns:cx2="http://schemas.microsoft.com/office/drawing/2015/10/21/chartex" xmlns:cx3="http://schemas.microsoft.com/office/drawing/2016/5/9/chartex" xmlns:cx4="http://schemas.microsoft.com/office/drawing/2016/5/10/chartex" xmlns:cx5="http://schemas.microsoft.com/office/drawing/2016/5/11/chartex" xmlns:cx6="http://schemas.microsoft.com/office/drawing/2016/5/12/chartex" xmlns:cx7="http://schemas.microsoft.com/office/drawing/2016/5/13/chartex" xmlns:cx8="http://schemas.microsoft.com/office/drawing/2016/5/14/chartex" xmlns:mc="http://schemas.openxmlformats.org/markup-compatibility/2006" xmlns:aink="http://schemas.microsoft.com/office/drawing/2016/ink" xmlns:am3d="http://schemas.microsoft.com/office/drawing/2017/model3d" xmlns:o="urn:schemas-microsoft-com:office:office" xmlns:oel="http://schemas.microsoft.com/office/2019/extlst" xmlns:r="http://schemas.openxmlformats.org/officeDocument/2006/relationships" xmlns:m="http://schemas.openxmlformats.org/officeDocument/2006/math" xmlns:v="urn:schemas-microsoft-com:vml" xmlns:wp14="http://schemas.microsoft.com/office/word/2010/wordprocessingDrawing" xmlns:wp="http://schemas.openxmlformats.org/drawingml/2006/wordprocessingDrawing" xmlns:w10="urn:schemas-microsoft-com:office:word" xmlns:w="http://schemas.openxmlformats.org/wordprocessingml/2006/main" xmlns:w14="http://schemas.microsoft.com/office/word/2010/wordml" xmlns:w15="http://schemas.microsoft.com/office/word/2012/wordml" xmlns:w16cex="http://schemas.microsoft.com/office/word/2018/wordml/cex" xmlns:w16cid="http://schemas.microsoft.com/office/word/2016/wordml/cid" xmlns:w16="http://schemas.microsoft.com/office/word/2018/wordml" xmlns:w16du="http://schemas.microsoft.com/office/word/2023/wordml/word16du" xmlns:w16sdtdh="http://schemas.microsoft.com/office/word/2020/wordml/sdtdatahash" xmlns:w16se="http://schemas.microsoft.com/office/word/2015/wordml/symex" xmlns:wpg="http://schemas.microsoft.com/office/word/2010/wordprocessingGroup" xmlns:wpi="http://schemas.microsoft.com/office/word/2010/wordprocessingInk" xmlns:wne="http://schemas.microsoft.com/office/word/2006/wordml" xmlns:wps="http://schemas.microsoft.com/office/word/2010/wordprocessingShape" mc:Ignorable="w14 w15 w16se w16cid w16 w16cex w16sdtdh w16du wp14">
   <w:body>
     <w:p>
       <w:pPr>
         <w:pStyle w:val="Heading1"/>
         <w:jc w:val="center"/>
         <w:rPr>
-          <w:rFonts w:hint="eastAsia"/>
           <w:color w:val="000000" w:themeColor="text1"/>
         </w:rPr>
       </w:pPr>
@@ -140,7 +139,19 @@
         <w:rPr>
           <w:color w:val="000000" w:themeColor="text1"/>
         </w:rPr>
-        <w:t>US-02: Analyse requirements</w:t>
+        <w:t xml:space="preserve">US-02: </w:t>
+      </w:r>
+      <w:r>
+        <w:rPr>
+          <w:color w:val="000000" w:themeColor="text1"/>
+        </w:rPr>
+        <w:t>Analyze</w:t>
+      </w:r>
+      <w:r>
+        <w:rPr>
+          <w:color w:val="000000" w:themeColor="text1"/>
+        </w:rPr>
+        <w:t xml:space="preserve"> requirements</w:t>
       </w:r>
     </w:p>
     <w:p>
@@ -155,7 +166,19 @@
         <w:rPr>
           <w:rFonts w:asciiTheme="minorHAnsi" w:hAnsiTheme="minorHAnsi"/>
         </w:rPr>
-        <w:t>As a software developer, I want the QA agent to identify important requirements and expected behaviours so that I know which parts of the system need to be tested.</w:t>
+        <w:t xml:space="preserve">As a software developer, I want the QA agent to identify important requirements and expected </w:t>
+      </w:r>
+      <w:r>
+        <w:rPr>
+          <w:rFonts w:asciiTheme="minorHAnsi" w:hAnsiTheme="minorHAnsi"/>
+        </w:rPr>
+        <w:t>behaviors</w:t>
+      </w:r>
+      <w:r>
+        <w:rPr>
+          <w:rFonts w:asciiTheme="minorHAnsi" w:hAnsiTheme="minorHAnsi"/>
+        </w:rPr>
+        <w:t xml:space="preserve"> so that I know which parts of the system need to be tested.</w:t>
       </w:r>
     </w:p>
     <w:p>
@@ -211,7 +234,31 @@
         <w:rPr>
           <w:rFonts w:asciiTheme="minorHAnsi" w:hAnsiTheme="minorHAnsi"/>
         </w:rPr>
-        <w:t>Expected behaviours are clearly stated or summarised.</w:t>
+        <w:t xml:space="preserve">Expected </w:t>
+      </w:r>
+      <w:r>
+        <w:rPr>
+          <w:rFonts w:asciiTheme="minorHAnsi" w:hAnsiTheme="minorHAnsi"/>
+        </w:rPr>
+        <w:t>behaviors</w:t>
+      </w:r>
+      <w:r>
+        <w:rPr>
+          <w:rFonts w:asciiTheme="minorHAnsi" w:hAnsiTheme="minorHAnsi"/>
+        </w:rPr>
+        <w:t xml:space="preserve"> are clearly stated or </w:t>
+      </w:r>
+      <w:r>
+        <w:rPr>
+          <w:rFonts w:asciiTheme="minorHAnsi" w:hAnsiTheme="minorHAnsi"/>
+        </w:rPr>
+        <w:t>summarized</w:t>
+      </w:r>
+      <w:r>
+        <w:rPr>
+          <w:rFonts w:asciiTheme="minorHAnsi" w:hAnsiTheme="minorHAnsi"/>
+        </w:rPr>
+        <w:t>.</w:t>
       </w:r>
     </w:p>
     <w:p>
@@ -315,7 +362,19 @@
         <w:rPr>
           <w:rFonts w:asciiTheme="minorHAnsi" w:hAnsiTheme="minorHAnsi"/>
         </w:rPr>
-        <w:t>Each proposed test is linked to a relevant requirement or expected behaviour.</w:t>
+        <w:t xml:space="preserve">Each proposed test is linked to a relevant requirement or expected </w:t>
+      </w:r>
+      <w:r>
+        <w:rPr>
+          <w:rFonts w:asciiTheme="minorHAnsi" w:hAnsiTheme="minorHAnsi"/>
+        </w:rPr>
+        <w:t>behavior</w:t>
+      </w:r>
+      <w:r>
+        <w:rPr>
+          <w:rFonts w:asciiTheme="minorHAnsi" w:hAnsiTheme="minorHAnsi"/>
+        </w:rPr>
+        <w:t>.</w:t>
       </w:r>
     </w:p>
     <w:p>
@@ -600,7 +659,19 @@
           <w:rFonts w:asciiTheme="minorHAnsi" w:hAnsiTheme="minorHAnsi"/>
         </w:rPr>
         <w:lastRenderedPageBreak/>
-        <w:t>The agent does not access secrets unless explicitly authorised and required by the approved test setup.</w:t>
+        <w:t xml:space="preserve">The agent does not access secrets unless explicitly </w:t>
+      </w:r>
+      <w:r>
+        <w:rPr>
+          <w:rFonts w:asciiTheme="minorHAnsi" w:hAnsiTheme="minorHAnsi"/>
+        </w:rPr>
+        <w:t>authorized</w:t>
+      </w:r>
+      <w:r>
+        <w:rPr>
+          <w:rFonts w:asciiTheme="minorHAnsi" w:hAnsiTheme="minorHAnsi"/>
+        </w:rPr>
+        <w:t xml:space="preserve"> and required by the approved test setup.</w:t>
       </w:r>
     </w:p>
     <w:p>
@@ -752,7 +823,19 @@
         <w:rPr>
           <w:rFonts w:asciiTheme="minorHAnsi" w:hAnsiTheme="minorHAnsi"/>
         </w:rPr>
-        <w:t>As a software developer, I want the QA agent to analyse failed tests using the available results and project information so that I can understand what may have caused the failure.</w:t>
+        <w:t xml:space="preserve">As a software developer, I want the QA agent to </w:t>
+      </w:r>
+      <w:r>
+        <w:rPr>
+          <w:rFonts w:asciiTheme="minorHAnsi" w:hAnsiTheme="minorHAnsi"/>
+        </w:rPr>
+        <w:t>analyze</w:t>
+      </w:r>
+      <w:r>
+        <w:rPr>
+          <w:rFonts w:asciiTheme="minorHAnsi" w:hAnsiTheme="minorHAnsi"/>
+        </w:rPr>
+        <w:t xml:space="preserve"> failed tests using the available results and project information so that I can understand what may have caused the failure.</w:t>
       </w:r>
     </w:p>
     <w:p>
@@ -860,7 +943,19 @@
         <w:rPr>
           <w:color w:val="000000" w:themeColor="text1"/>
         </w:rPr>
-        <w:t>US-08: Summarise QA findings</w:t>
+        <w:t xml:space="preserve">US-08: </w:t>
+      </w:r>
+      <w:r>
+        <w:rPr>
+          <w:color w:val="000000" w:themeColor="text1"/>
+        </w:rPr>
+        <w:t>Summarize</w:t>
+      </w:r>
+      <w:r>
+        <w:rPr>
+          <w:color w:val="000000" w:themeColor="text1"/>
+        </w:rPr>
+        <w:t xml:space="preserve"> QA findings</w:t>
       </w:r>
     </w:p>
     <w:p>
@@ -875,7 +970,19 @@
         <w:rPr>
           <w:rFonts w:asciiTheme="minorHAnsi" w:hAnsiTheme="minorHAnsi"/>
         </w:rPr>
-        <w:t>As a software developer, I want the QA agent to summarise the test results and important failures so that I can understand the overall state of the application without reviewing every result manually.</w:t>
+        <w:t xml:space="preserve">As a software developer, I want the QA agent to </w:t>
+      </w:r>
+      <w:r>
+        <w:rPr>
+          <w:rFonts w:asciiTheme="minorHAnsi" w:hAnsiTheme="minorHAnsi"/>
+        </w:rPr>
+        <w:t>summarize</w:t>
+      </w:r>
+      <w:r>
+        <w:rPr>
+          <w:rFonts w:asciiTheme="minorHAnsi" w:hAnsiTheme="minorHAnsi"/>
+        </w:rPr>
+        <w:t xml:space="preserve"> the test results and important failures so that I can understand the overall state of the application without reviewing every result manually.</w:t>
       </w:r>
     </w:p>
     <w:p>
@@ -1073,7 +1180,19 @@
         <w:rPr>
           <w:rFonts w:asciiTheme="minorHAnsi" w:hAnsiTheme="minorHAnsi"/>
         </w:rPr>
-        <w:t>The report includes the expected and actual behaviour when this information is available.</w:t>
+        <w:t xml:space="preserve">The report includes the expected and actual </w:t>
+      </w:r>
+      <w:r>
+        <w:rPr>
+          <w:rFonts w:asciiTheme="minorHAnsi" w:hAnsiTheme="minorHAnsi"/>
+        </w:rPr>
+        <w:t>behavior</w:t>
+      </w:r>
+      <w:r>
+        <w:rPr>
+          <w:rFonts w:asciiTheme="minorHAnsi" w:hAnsiTheme="minorHAnsi"/>
+        </w:rPr>
+        <w:t xml:space="preserve"> when this information is available.</w:t>
       </w:r>
     </w:p>
     <w:p>
@@ -1495,14 +1614,11 @@
 </file>
 
 <file path=word/endnotes.xml><?xml version="1.0" encoding="utf-8"?>
-<w:endnotes xmlns:wpc="http://schemas.microsoft.com/office/word/2010/wordprocessingCanvas" xmlns:cx="http://schemas.microsoft.com/office/drawing/2014/chartex" xmlns:cx1="http://schemas.microsoft.com/office/drawing/2015/9/8/chartex" xmlns:cx2="http://schemas.microsoft.com/office/drawing/2015/10/21/chartex" xmlns:cx3="http://schemas.microsoft.com/office/drawing/2016/5/9/chartex" xmlns:cx4="http://schemas.microsoft.com/office/drawing/2016/5/10/chartex" xmlns:cx5="http://schemas.microsoft.com/office/drawing/2016/5/11/chartex" xmlns:cx6="http://schemas.microsoft.com/office/drawing/2016/5/12/chartex" xmlns:cx7="http://schemas.microsoft.com/office/drawing/2016/5/13/chartex" xmlns:cx8="http://schemas.microsoft.com/office/drawing/2016/5/14/chartex" xmlns:mc="http://schemas.openxmlformats.org/markup-compatibility/2006" xmlns:m="http://schemas.openxmlformats.org/officeDocument/2006/math" xmlns:aink="http://schemas.microsoft.com/office/drawing/2016/ink" xmlns:am3d="http://schemas.microsoft.com/office/drawing/2017/model3d" xmlns:oel="http://schemas.microsoft.com/office/2019/extlst" xmlns:r="http://schemas.openxmlformats.org/officeDocument/2006/relationships" xmlns:wp14="http://schemas.microsoft.com/office/word/2010/wordprocessingDrawing" xmlns:wp="http://schemas.openxmlformats.org/drawingml/2006/wordprocessingDrawing" xmlns:wpg="http://schemas.microsoft.com/office/word/2010/wordprocessingGroup" xmlns:wpi="http://schemas.microsoft.com/office/word/2010/wordprocessingInk" xmlns:wps="http://schemas.microsoft.com/office/word/2010/wordprocessingShape" xmlns:o="urn:schemas-microsoft-com:office:office" xmlns:v="urn:schemas-microsoft-com:vml" xmlns:w10="urn:schemas-microsoft-com:office:word" xmlns:w="http://schemas.openxmlformats.org/wordprocessingml/2006/main" xmlns:w14="http://schemas.microsoft.com/office/word/2010/wordml" xmlns:w15="http://schemas.microsoft.com/office/word/2012/wordml" xmlns:w16cex="http://schemas.microsoft.com/office/word/2018/wordml/cex" xmlns:w16cid="http://schemas.microsoft.com/office/word/2016/wordml/cid" xmlns:w16="http://schemas.microsoft.com/office/word/2018/wordml" xmlns:w16sdtdh="http://schemas.microsoft.com/office/word/2020/wordml/sdtdatahash" xmlns:w16sdtfl="http://schemas.microsoft.com/office/word/2024/wordml/sdtformatlock" xmlns:w16se="http://schemas.microsoft.com/office/word/2015/wordml/symex" xmlns:w16du="http://schemas.microsoft.com/office/word/2023/wordml/word16du" xmlns:wne="http://schemas.microsoft.com/office/word/2006/wordml" mc:Ignorable="w14 w15 w16se w16cid w16 w16cex w16sdtdh w16sdtfl w16du wp14">
+<w:endnotes xmlns:wpc="http://schemas.microsoft.com/office/word/2010/wordprocessingCanvas" xmlns:cx="http://schemas.microsoft.com/office/drawing/2014/chartex" xmlns:cx1="http://schemas.microsoft.com/office/drawing/2015/9/8/chartex" xmlns:cx2="http://schemas.microsoft.com/office/drawing/2015/10/21/chartex" xmlns:cx3="http://schemas.microsoft.com/office/drawing/2016/5/9/chartex" xmlns:cx4="http://schemas.microsoft.com/office/drawing/2016/5/10/chartex" xmlns:cx5="http://schemas.microsoft.com/office/drawing/2016/5/11/chartex" xmlns:cx6="http://schemas.microsoft.com/office/drawing/2016/5/12/chartex" xmlns:cx7="http://schemas.microsoft.com/office/drawing/2016/5/13/chartex" xmlns:cx8="http://schemas.microsoft.com/office/drawing/2016/5/14/chartex" xmlns:mc="http://schemas.openxmlformats.org/markup-compatibility/2006" xmlns:aink="http://schemas.microsoft.com/office/drawing/2016/ink" xmlns:am3d="http://schemas.microsoft.com/office/drawing/2017/model3d" xmlns:o="urn:schemas-microsoft-com:office:office" xmlns:oel="http://schemas.microsoft.com/office/2019/extlst" xmlns:r="http://schemas.openxmlformats.org/officeDocument/2006/relationships" xmlns:m="http://schemas.openxmlformats.org/officeDocument/2006/math" xmlns:v="urn:schemas-microsoft-com:vml" xmlns:wp14="http://schemas.microsoft.com/office/word/2010/wordprocessingDrawing" xmlns:wp="http://schemas.openxmlformats.org/drawingml/2006/wordprocessingDrawing" xmlns:w10="urn:schemas-microsoft-com:office:word" xmlns:w="http://schemas.openxmlformats.org/wordprocessingml/2006/main" xmlns:w14="http://schemas.microsoft.com/office/word/2010/wordml" xmlns:w15="http://schemas.microsoft.com/office/word/2012/wordml" xmlns:w16cex="http://schemas.microsoft.com/office/word/2018/wordml/cex" xmlns:w16cid="http://schemas.microsoft.com/office/word/2016/wordml/cid" xmlns:w16="http://schemas.microsoft.com/office/word/2018/wordml" xmlns:w16du="http://schemas.microsoft.com/office/word/2023/wordml/word16du" xmlns:w16sdtdh="http://schemas.microsoft.com/office/word/2020/wordml/sdtdatahash" xmlns:w16se="http://schemas.microsoft.com/office/word/2015/wordml/symex" xmlns:wpg="http://schemas.microsoft.com/office/word/2010/wordprocessingGroup" xmlns:wpi="http://schemas.microsoft.com/office/word/2010/wordprocessingInk" xmlns:wne="http://schemas.microsoft.com/office/word/2006/wordml" xmlns:wps="http://schemas.microsoft.com/office/word/2010/wordprocessingShape" mc:Ignorable="w14 w15 w16se w16cid w16 w16cex w16sdtdh w16du wp14">
   <w:endnote w:type="separator" w:id="-1">
     <w:p>
       <w:pPr>
         <w:spacing w:after="0" w:line="240" w:lineRule="auto"/>
-        <w:rPr>
-          <w:rFonts w:hint="eastAsia"/>
-        </w:rPr>
       </w:pPr>
       <w:r>
         <w:separator/>
@@ -1513,9 +1629,6 @@
     <w:p>
       <w:pPr>
         <w:spacing w:after="0" w:line="240" w:lineRule="auto"/>
-        <w:rPr>
-          <w:rFonts w:hint="eastAsia"/>
-        </w:rPr>
       </w:pPr>
       <w:r>
         <w:continuationSeparator/>
@@ -1526,28 +1639,22 @@
 </file>
 
 <file path=word/footer1.xml><?xml version="1.0" encoding="utf-8"?>
-<w:ftr xmlns:wpc="http://schemas.microsoft.com/office/word/2010/wordprocessingCanvas" xmlns:cx="http://schemas.microsoft.com/office/drawing/2014/chartex" xmlns:cx1="http://schemas.microsoft.com/office/drawing/2015/9/8/chartex" xmlns:cx2="http://schemas.microsoft.com/office/drawing/2015/10/21/chartex" xmlns:cx3="http://schemas.microsoft.com/office/drawing/2016/5/9/chartex" xmlns:cx4="http://schemas.microsoft.com/office/drawing/2016/5/10/chartex" xmlns:cx5="http://schemas.microsoft.com/office/drawing/2016/5/11/chartex" xmlns:cx6="http://schemas.microsoft.com/office/drawing/2016/5/12/chartex" xmlns:cx7="http://schemas.microsoft.com/office/drawing/2016/5/13/chartex" xmlns:cx8="http://schemas.microsoft.com/office/drawing/2016/5/14/chartex" xmlns:mc="http://schemas.openxmlformats.org/markup-compatibility/2006" xmlns:m="http://schemas.openxmlformats.org/officeDocument/2006/math" xmlns:aink="http://schemas.microsoft.com/office/drawing/2016/ink" xmlns:am3d="http://schemas.microsoft.com/office/drawing/2017/model3d" xmlns:oel="http://schemas.microsoft.com/office/2019/extlst" xmlns:r="http://schemas.openxmlformats.org/officeDocument/2006/relationships" xmlns:wp14="http://schemas.microsoft.com/office/word/2010/wordprocessingDrawing" xmlns:wp="http://schemas.openxmlformats.org/drawingml/2006/wordprocessingDrawing" xmlns:wpg="http://schemas.microsoft.com/office/word/2010/wordprocessingGroup" xmlns:wpi="http://schemas.microsoft.com/office/word/2010/wordprocessingInk" xmlns:wps="http://schemas.microsoft.com/office/word/2010/wordprocessingShape" xmlns:o="urn:schemas-microsoft-com:office:office" xmlns:v="urn:schemas-microsoft-com:vml" xmlns:w10="urn:schemas-microsoft-com:office:word" xmlns:w="http://schemas.openxmlformats.org/wordprocessingml/2006/main" xmlns:w14="http://schemas.microsoft.com/office/word/2010/wordml" xmlns:w15="http://schemas.microsoft.com/office/word/2012/wordml" xmlns:w16cex="http://schemas.microsoft.com/office/word/2018/wordml/cex" xmlns:w16cid="http://schemas.microsoft.com/office/word/2016/wordml/cid" xmlns:w16="http://schemas.microsoft.com/office/word/2018/wordml" xmlns:w16sdtdh="http://schemas.microsoft.com/office/word/2020/wordml/sdtdatahash" xmlns:w16sdtfl="http://schemas.microsoft.com/office/word/2024/wordml/sdtformatlock" xmlns:w16se="http://schemas.microsoft.com/office/word/2015/wordml/symex" xmlns:w16du="http://schemas.microsoft.com/office/word/2023/wordml/word16du" xmlns:wne="http://schemas.microsoft.com/office/word/2006/wordml" mc:Ignorable="w14 w15 w16se w16cid w16 w16cex w16sdtdh w16sdtfl w16du wp14">
+<w:ftr xmlns:wpc="http://schemas.microsoft.com/office/word/2010/wordprocessingCanvas" xmlns:cx="http://schemas.microsoft.com/office/drawing/2014/chartex" xmlns:cx1="http://schemas.microsoft.com/office/drawing/2015/9/8/chartex" xmlns:cx2="http://schemas.microsoft.com/office/drawing/2015/10/21/chartex" xmlns:cx3="http://schemas.microsoft.com/office/drawing/2016/5/9/chartex" xmlns:cx4="http://schemas.microsoft.com/office/drawing/2016/5/10/chartex" xmlns:cx5="http://schemas.microsoft.com/office/drawing/2016/5/11/chartex" xmlns:cx6="http://schemas.microsoft.com/office/drawing/2016/5/12/chartex" xmlns:cx7="http://schemas.microsoft.com/office/drawing/2016/5/13/chartex" xmlns:cx8="http://schemas.microsoft.com/office/drawing/2016/5/14/chartex" xmlns:mc="http://schemas.openxmlformats.org/markup-compatibility/2006" xmlns:aink="http://schemas.microsoft.com/office/drawing/2016/ink" xmlns:am3d="http://schemas.microsoft.com/office/drawing/2017/model3d" xmlns:o="urn:schemas-microsoft-com:office:office" xmlns:oel="http://schemas.microsoft.com/office/2019/extlst" xmlns:r="http://schemas.openxmlformats.org/officeDocument/2006/relationships" xmlns:m="http://schemas.openxmlformats.org/officeDocument/2006/math" xmlns:v="urn:schemas-microsoft-com:vml" xmlns:wp14="http://schemas.microsoft.com/office/word/2010/wordprocessingDrawing" xmlns:wp="http://schemas.openxmlformats.org/drawingml/2006/wordprocessingDrawing" xmlns:w10="urn:schemas-microsoft-com:office:word" xmlns:w="http://schemas.openxmlformats.org/wordprocessingml/2006/main" xmlns:w14="http://schemas.microsoft.com/office/word/2010/wordml" xmlns:w15="http://schemas.microsoft.com/office/word/2012/wordml" xmlns:w16cex="http://schemas.microsoft.com/office/word/2018/wordml/cex" xmlns:w16cid="http://schemas.microsoft.com/office/word/2016/wordml/cid" xmlns:w16="http://schemas.microsoft.com/office/word/2018/wordml" xmlns:w16du="http://schemas.microsoft.com/office/word/2023/wordml/word16du" xmlns:w16sdtdh="http://schemas.microsoft.com/office/word/2020/wordml/sdtdatahash" xmlns:w16se="http://schemas.microsoft.com/office/word/2015/wordml/symex" xmlns:wpg="http://schemas.microsoft.com/office/word/2010/wordprocessingGroup" xmlns:wpi="http://schemas.microsoft.com/office/word/2010/wordprocessingInk" xmlns:wne="http://schemas.microsoft.com/office/word/2006/wordml" xmlns:wps="http://schemas.microsoft.com/office/word/2010/wordprocessingShape" mc:Ignorable="w14 w15 w16se w16cid w16 w16cex w16sdtdh w16du wp14">
   <w:p>
     <w:pPr>
       <w:pStyle w:val="Footer"/>
       <w:jc w:val="center"/>
-      <w:rPr>
-        <w:rFonts w:hint="eastAsia"/>
-      </w:rPr>
     </w:pPr>
   </w:p>
 </w:ftr>
 </file>
 
 <file path=word/footnotes.xml><?xml version="1.0" encoding="utf-8"?>
-<w:footnotes xmlns:wpc="http://schemas.microsoft.com/office/word/2010/wordprocessingCanvas" xmlns:cx="http://schemas.microsoft.com/office/drawing/2014/chartex" xmlns:cx1="http://schemas.microsoft.com/office/drawing/2015/9/8/chartex" xmlns:cx2="http://schemas.microsoft.com/office/drawing/2015/10/21/chartex" xmlns:cx3="http://schemas.microsoft.com/office/drawing/2016/5/9/chartex" xmlns:cx4="http://schemas.microsoft.com/office/drawing/2016/5/10/chartex" xmlns:cx5="http://schemas.microsoft.com/office/drawing/2016/5/11/chartex" xmlns:cx6="http://schemas.microsoft.com/office/drawing/2016/5/12/chartex" xmlns:cx7="http://schemas.microsoft.com/office/drawing/2016/5/13/chartex" xmlns:cx8="http://schemas.microsoft.com/office/drawing/2016/5/14/chartex" xmlns:mc="http://schemas.openxmlformats.org/markup-compatibility/2006" xmlns:m="http://schemas.openxmlformats.org/officeDocument/2006/math" xmlns:aink="http://schemas.microsoft.com/office/drawing/2016/ink" xmlns:am3d="http://schemas.microsoft.com/office/drawing/2017/model3d" xmlns:oel="http://schemas.microsoft.com/office/2019/extlst" xmlns:r="http://schemas.openxmlformats.org/officeDocument/2006/relationships" xmlns:wp14="http://schemas.microsoft.com/office/word/2010/wordprocessingDrawing" xmlns:wp="http://schemas.openxmlformats.org/drawingml/2006/wordprocessingDrawing" xmlns:wpg="http://schemas.microsoft.com/office/word/2010/wordprocessingGroup" xmlns:wpi="http://schemas.microsoft.com/office/word/2010/wordprocessingInk" xmlns:wps="http://schemas.microsoft.com/office/word/2010/wordprocessingShape" xmlns:o="urn:schemas-microsoft-com:office:office" xmlns:v="urn:schemas-microsoft-com:vml" xmlns:w10="urn:schemas-microsoft-com:office:word" xmlns:w="http://schemas.openxmlformats.org/wordprocessingml/2006/main" xmlns:w14="http://schemas.microsoft.com/office/word/2010/wordml" xmlns:w15="http://schemas.microsoft.com/office/word/2012/wordml" xmlns:w16cex="http://schemas.microsoft.com/office/word/2018/wordml/cex" xmlns:w16cid="http://schemas.microsoft.com/office/word/2016/wordml/cid" xmlns:w16="http://schemas.microsoft.com/office/word/2018/wordml" xmlns:w16sdtdh="http://schemas.microsoft.com/office/word/2020/wordml/sdtdatahash" xmlns:w16sdtfl="http://schemas.microsoft.com/office/word/2024/wordml/sdtformatlock" xmlns:w16se="http://schemas.microsoft.com/office/word/2015/wordml/symex" xmlns:w16du="http://schemas.microsoft.com/office/word/2023/wordml/word16du" xmlns:wne="http://schemas.microsoft.com/office/word/2006/wordml" mc:Ignorable="w14 w15 w16se w16cid w16 w16cex w16sdtdh w16sdtfl w16du wp14">
+<w:footnotes xmlns:wpc="http://schemas.microsoft.com/office/word/2010/wordprocessingCanvas" xmlns:cx="http://schemas.microsoft.com/office/drawing/2014/chartex" xmlns:cx1="http://schemas.microsoft.com/office/drawing/2015/9/8/chartex" xmlns:cx2="http://schemas.microsoft.com/office/drawing/2015/10/21/chartex" xmlns:cx3="http://schemas.microsoft.com/office/drawing/2016/5/9/chartex" xmlns:cx4="http://schemas.microsoft.com/office/drawing/2016/5/10/chartex" xmlns:cx5="http://schemas.microsoft.com/office/drawing/2016/5/11/chartex" xmlns:cx6="http://schemas.microsoft.com/office/drawing/2016/5/12/chartex" xmlns:cx7="http://schemas.microsoft.com/office/drawing/2016/5/13/chartex" xmlns:cx8="http://schemas.microsoft.com/office/drawing/2016/5/14/chartex" xmlns:mc="http://schemas.openxmlformats.org/markup-compatibility/2006" xmlns:aink="http://schemas.microsoft.com/office/drawing/2016/ink" xmlns:am3d="http://schemas.microsoft.com/office/drawing/2017/model3d" xmlns:o="urn:schemas-microsoft-com:office:office" xmlns:oel="http://schemas.microsoft.com/office/2019/extlst" xmlns:r="http://schemas.openxmlformats.org/officeDocument/2006/relationships" xmlns:m="http://schemas.openxmlformats.org/officeDocument/2006/math" xmlns:v="urn:schemas-microsoft-com:vml" xmlns:wp14="http://schemas.microsoft.com/office/word/2010/wordprocessingDrawing" xmlns:wp="http://schemas.openxmlformats.org/drawingml/2006/wordprocessingDrawing" xmlns:w10="urn:schemas-microsoft-com:office:word" xmlns:w="http://schemas.openxmlformats.org/wordprocessingml/2006/main" xmlns:w14="http://schemas.microsoft.com/office/word/2010/wordml" xmlns:w15="http://schemas.microsoft.com/office/word/2012/wordml" xmlns:w16cex="http://schemas.microsoft.com/office/word/2018/wordml/cex" xmlns:w16cid="http://schemas.microsoft.com/office/word/2016/wordml/cid" xmlns:w16="http://schemas.microsoft.com/office/word/2018/wordml" xmlns:w16du="http://schemas.microsoft.com/office/word/2023/wordml/word16du" xmlns:w16sdtdh="http://schemas.microsoft.com/office/word/2020/wordml/sdtdatahash" xmlns:w16se="http://schemas.microsoft.com/office/word/2015/wordml/symex" xmlns:wpg="http://schemas.microsoft.com/office/word/2010/wordprocessingGroup" xmlns:wpi="http://schemas.microsoft.com/office/word/2010/wordprocessingInk" xmlns:wne="http://schemas.microsoft.com/office/word/2006/wordml" xmlns:wps="http://schemas.microsoft.com/office/word/2010/wordprocessingShape" mc:Ignorable="w14 w15 w16se w16cid w16 w16cex w16sdtdh w16du wp14">
   <w:footnote w:type="separator" w:id="-1">
     <w:p>
       <w:pPr>
         <w:spacing w:after="0" w:line="240" w:lineRule="auto"/>
-        <w:rPr>
-          <w:rFonts w:hint="eastAsia"/>
-        </w:rPr>
       </w:pPr>
       <w:r>
         <w:separator/>
@@ -1558,9 +1665,6 @@
     <w:p>
       <w:pPr>
         <w:spacing w:after="0" w:line="240" w:lineRule="auto"/>
-        <w:rPr>
-          <w:rFonts w:hint="eastAsia"/>
-        </w:rPr>
       </w:pPr>
       <w:r>
         <w:continuationSeparator/>
@@ -1571,7 +1675,7 @@
 </file>
 
 <file path=word/numbering.xml><?xml version="1.0" encoding="utf-8"?>
-<w:numbering xmlns:wpc="http://schemas.microsoft.com/office/word/2010/wordprocessingCanvas" xmlns:cx="http://schemas.microsoft.com/office/drawing/2014/chartex" xmlns:cx1="http://schemas.microsoft.com/office/drawing/2015/9/8/chartex" xmlns:cx2="http://schemas.microsoft.com/office/drawing/2015/10/21/chartex" xmlns:cx3="http://schemas.microsoft.com/office/drawing/2016/5/9/chartex" xmlns:cx4="http://schemas.microsoft.com/office/drawing/2016/5/10/chartex" xmlns:cx5="http://schemas.microsoft.com/office/drawing/2016/5/11/chartex" xmlns:cx6="http://schemas.microsoft.com/office/drawing/2016/5/12/chartex" xmlns:cx7="http://schemas.microsoft.com/office/drawing/2016/5/13/chartex" xmlns:cx8="http://schemas.microsoft.com/office/drawing/2016/5/14/chartex" xmlns:mc="http://schemas.openxmlformats.org/markup-compatibility/2006" xmlns:m="http://schemas.openxmlformats.org/officeDocument/2006/math" xmlns:aink="http://schemas.microsoft.com/office/drawing/2016/ink" xmlns:am3d="http://schemas.microsoft.com/office/drawing/2017/model3d" xmlns:oel="http://schemas.microsoft.com/office/2019/extlst" xmlns:r="http://schemas.openxmlformats.org/officeDocument/2006/relationships" xmlns:wp14="http://schemas.microsoft.com/office/word/2010/wordprocessingDrawing" xmlns:wp="http://schemas.openxmlformats.org/drawingml/2006/wordprocessingDrawing" xmlns:wpg="http://schemas.microsoft.com/office/word/2010/wordprocessingGroup" xmlns:wpi="http://schemas.microsoft.com/office/word/2010/wordprocessingInk" xmlns:wps="http://schemas.microsoft.com/office/word/2010/wordprocessingShape" xmlns:o="urn:schemas-microsoft-com:office:office" xmlns:v="urn:schemas-microsoft-com:vml" xmlns:w10="urn:schemas-microsoft-com:office:word" xmlns:w="http://schemas.openxmlformats.org/wordprocessingml/2006/main" xmlns:w14="http://schemas.microsoft.com/office/word/2010/wordml" xmlns:w15="http://schemas.microsoft.com/office/word/2012/wordml" xmlns:w16cex="http://schemas.microsoft.com/office/word/2018/wordml/cex" xmlns:w16cid="http://schemas.microsoft.com/office/word/2016/wordml/cid" xmlns:w16="http://schemas.microsoft.com/office/word/2018/wordml" xmlns:w16sdtdh="http://schemas.microsoft.com/office/word/2020/wordml/sdtdatahash" xmlns:w16sdtfl="http://schemas.microsoft.com/office/word/2024/wordml/sdtformatlock" xmlns:w16se="http://schemas.microsoft.com/office/word/2015/wordml/symex" xmlns:w16du="http://schemas.microsoft.com/office/word/2023/wordml/word16du" xmlns:wne="http://schemas.microsoft.com/office/word/2006/wordml" mc:Ignorable="w14 w15 w16se w16cid w16 w16cex w16sdtdh w16sdtfl w16du wp14">
+<w:numbering xmlns:wpc="http://schemas.microsoft.com/office/word/2010/wordprocessingCanvas" xmlns:cx="http://schemas.microsoft.com/office/drawing/2014/chartex" xmlns:cx1="http://schemas.microsoft.com/office/drawing/2015/9/8/chartex" xmlns:cx2="http://schemas.microsoft.com/office/drawing/2015/10/21/chartex" xmlns:cx3="http://schemas.microsoft.com/office/drawing/2016/5/9/chartex" xmlns:cx4="http://schemas.microsoft.com/office/drawing/2016/5/10/chartex" xmlns:cx5="http://schemas.microsoft.com/office/drawing/2016/5/11/chartex" xmlns:cx6="http://schemas.microsoft.com/office/drawing/2016/5/12/chartex" xmlns:cx7="http://schemas.microsoft.com/office/drawing/2016/5/13/chartex" xmlns:cx8="http://schemas.microsoft.com/office/drawing/2016/5/14/chartex" xmlns:mc="http://schemas.openxmlformats.org/markup-compatibility/2006" xmlns:aink="http://schemas.microsoft.com/office/drawing/2016/ink" xmlns:am3d="http://schemas.microsoft.com/office/drawing/2017/model3d" xmlns:o="urn:schemas-microsoft-com:office:office" xmlns:oel="http://schemas.microsoft.com/office/2019/extlst" xmlns:r="http://schemas.openxmlformats.org/officeDocument/2006/relationships" xmlns:m="http://schemas.openxmlformats.org/officeDocument/2006/math" xmlns:v="urn:schemas-microsoft-com:vml" xmlns:wp14="http://schemas.microsoft.com/office/word/2010/wordprocessingDrawing" xmlns:wp="http://schemas.openxmlformats.org/drawingml/2006/wordprocessingDrawing" xmlns:w10="urn:schemas-microsoft-com:office:word" xmlns:w="http://schemas.openxmlformats.org/wordprocessingml/2006/main" xmlns:w14="http://schemas.microsoft.com/office/word/2010/wordml" xmlns:w15="http://schemas.microsoft.com/office/word/2012/wordml" xmlns:w16cex="http://schemas.microsoft.com/office/word/2018/wordml/cex" xmlns:w16cid="http://schemas.microsoft.com/office/word/2016/wordml/cid" xmlns:w16="http://schemas.microsoft.com/office/word/2018/wordml" xmlns:w16du="http://schemas.microsoft.com/office/word/2023/wordml/word16du" xmlns:w16sdtdh="http://schemas.microsoft.com/office/word/2020/wordml/sdtdatahash" xmlns:w16se="http://schemas.microsoft.com/office/word/2015/wordml/symex" xmlns:wpg="http://schemas.microsoft.com/office/word/2010/wordprocessingGroup" xmlns:wpi="http://schemas.microsoft.com/office/word/2010/wordprocessingInk" xmlns:wne="http://schemas.microsoft.com/office/word/2006/wordml" xmlns:wps="http://schemas.microsoft.com/office/word/2010/wordprocessingShape" mc:Ignorable="w14 w15 w16se w16cid w16 w16cex w16sdtdh w16du wp14">
   <w:abstractNum w:abstractNumId="0" w15:restartNumberingAfterBreak="0">
     <w:nsid w:val="FFFFFF7C"/>
     <w:multiLevelType w:val="singleLevel"/>
@@ -3398,7 +3502,7 @@
 </file>
 
 <file path=word/styles.xml><?xml version="1.0" encoding="utf-8"?>
-<w:styles xmlns:mc="http://schemas.openxmlformats.org/markup-compatibility/2006" xmlns:r="http://schemas.openxmlformats.org/officeDocument/2006/relationships" xmlns:w="http://schemas.openxmlformats.org/wordprocessingml/2006/main" xmlns:w14="http://schemas.microsoft.com/office/word/2010/wordml" xmlns:w15="http://schemas.microsoft.com/office/word/2012/wordml" xmlns:w16cex="http://schemas.microsoft.com/office/word/2018/wordml/cex" xmlns:w16cid="http://schemas.microsoft.com/office/word/2016/wordml/cid" xmlns:w16="http://schemas.microsoft.com/office/word/2018/wordml" xmlns:w16sdtdh="http://schemas.microsoft.com/office/word/2020/wordml/sdtdatahash" xmlns:w16sdtfl="http://schemas.microsoft.com/office/word/2024/wordml/sdtformatlock" xmlns:w16se="http://schemas.microsoft.com/office/word/2015/wordml/symex" xmlns:w16du="http://schemas.microsoft.com/office/word/2023/wordml/word16du" mc:Ignorable="w14 w15 w16se w16cid w16 w16cex w16sdtdh w16sdtfl w16du">
+<w:styles xmlns:mc="http://schemas.openxmlformats.org/markup-compatibility/2006" xmlns:r="http://schemas.openxmlformats.org/officeDocument/2006/relationships" xmlns:w="http://schemas.openxmlformats.org/wordprocessingml/2006/main" xmlns:w14="http://schemas.microsoft.com/office/word/2010/wordml" xmlns:w15="http://schemas.microsoft.com/office/word/2012/wordml" xmlns:w16cex="http://schemas.microsoft.com/office/word/2018/wordml/cex" xmlns:w16cid="http://schemas.microsoft.com/office/word/2016/wordml/cid" xmlns:w16="http://schemas.microsoft.com/office/word/2018/wordml" xmlns:w16du="http://schemas.microsoft.com/office/word/2023/wordml/word16du" xmlns:w16sdtdh="http://schemas.microsoft.com/office/word/2020/wordml/sdtdatahash" xmlns:w16se="http://schemas.microsoft.com/office/word/2015/wordml/symex" mc:Ignorable="w14 w15 w16se w16cid w16 w16cex w16sdtdh w16du">
   <w:docDefaults>
     <w:rPrDefault>
       <w:rPr>
@@ -12922,7 +13026,7 @@
       </w:tcPr>
     </w:tblStylePr>
   </w:style>
-  <w:style w:type="table" w:styleId="ColourfulShading">
+  <w:style w:type="table" w:styleId="ColorfulShading">
     <w:name w:val="Colorful Shading"/>
     <w:basedOn w:val="TableNormal"/>
     <w:uiPriority w:val="71"/>
@@ -13037,7 +13141,7 @@
       </w:rPr>
     </w:tblStylePr>
   </w:style>
-  <w:style w:type="table" w:styleId="ColourfulShadingAccent1">
+  <w:style w:type="table" w:styleId="ColorfulShading-Accent1">
     <w:name w:val="Colorful Shading Accent 1"/>
     <w:basedOn w:val="TableNormal"/>
     <w:uiPriority w:val="71"/>
@@ -13152,7 +13256,7 @@
       </w:rPr>
     </w:tblStylePr>
   </w:style>
-  <w:style w:type="table" w:styleId="ColourfulShadingAccent2">
+  <w:style w:type="table" w:styleId="ColorfulShading-Accent2">
     <w:name w:val="Colorful Shading Accent 2"/>
     <w:basedOn w:val="TableNormal"/>
     <w:uiPriority w:val="71"/>
@@ -13267,7 +13371,7 @@
       </w:rPr>
     </w:tblStylePr>
   </w:style>
-  <w:style w:type="table" w:styleId="ColourfulShadingAccent3">
+  <w:style w:type="table" w:styleId="ColorfulShading-Accent3">
     <w:name w:val="Colorful Shading Accent 3"/>
     <w:basedOn w:val="TableNormal"/>
     <w:uiPriority w:val="71"/>
@@ -13372,7 +13476,7 @@
       </w:tcPr>
     </w:tblStylePr>
   </w:style>
-  <w:style w:type="table" w:styleId="ColourfulShadingAccent4">
+  <w:style w:type="table" w:styleId="ColorfulShading-Accent4">
     <w:name w:val="Colorful Shading Accent 4"/>
     <w:basedOn w:val="TableNormal"/>
     <w:uiPriority w:val="71"/>
@@ -13487,7 +13591,7 @@
       </w:rPr>
     </w:tblStylePr>
   </w:style>
-  <w:style w:type="table" w:styleId="ColourfulShadingAccent5">
+  <w:style w:type="table" w:styleId="ColorfulShading-Accent5">
     <w:name w:val="Colorful Shading Accent 5"/>
     <w:basedOn w:val="TableNormal"/>
     <w:uiPriority w:val="71"/>
@@ -13602,7 +13706,7 @@
       </w:rPr>
     </w:tblStylePr>
   </w:style>
-  <w:style w:type="table" w:styleId="ColourfulShadingAccent6">
+  <w:style w:type="table" w:styleId="ColorfulShading-Accent6">
     <w:name w:val="Colorful Shading Accent 6"/>
     <w:basedOn w:val="TableNormal"/>
     <w:uiPriority w:val="71"/>
@@ -13717,7 +13821,7 @@
       </w:rPr>
     </w:tblStylePr>
   </w:style>
-  <w:style w:type="table" w:styleId="ColourfulList">
+  <w:style w:type="table" w:styleId="ColorfulList">
     <w:name w:val="Colorful List"/>
     <w:basedOn w:val="TableNormal"/>
     <w:uiPriority w:val="72"/>
@@ -13796,7 +13900,7 @@
       </w:tcPr>
     </w:tblStylePr>
   </w:style>
-  <w:style w:type="table" w:styleId="ColourfulListAccent1">
+  <w:style w:type="table" w:styleId="ColorfulList-Accent1">
     <w:name w:val="Colorful List Accent 1"/>
     <w:basedOn w:val="TableNormal"/>
     <w:uiPriority w:val="72"/>
@@ -13875,7 +13979,7 @@
       </w:tcPr>
     </w:tblStylePr>
   </w:style>
-  <w:style w:type="table" w:styleId="ColourfulListAccent2">
+  <w:style w:type="table" w:styleId="ColorfulList-Accent2">
     <w:name w:val="Colorful List Accent 2"/>
     <w:basedOn w:val="TableNormal"/>
     <w:uiPriority w:val="72"/>
@@ -13954,7 +14058,7 @@
       </w:tcPr>
     </w:tblStylePr>
   </w:style>
-  <w:style w:type="table" w:styleId="ColourfulListAccent3">
+  <w:style w:type="table" w:styleId="ColorfulList-Accent3">
     <w:name w:val="Colorful List Accent 3"/>
     <w:basedOn w:val="TableNormal"/>
     <w:uiPriority w:val="72"/>
@@ -14033,7 +14137,7 @@
       </w:tcPr>
     </w:tblStylePr>
   </w:style>
-  <w:style w:type="table" w:styleId="ColourfulListAccent4">
+  <w:style w:type="table" w:styleId="ColorfulList-Accent4">
     <w:name w:val="Colorful List Accent 4"/>
     <w:basedOn w:val="TableNormal"/>
     <w:uiPriority w:val="72"/>
@@ -14112,7 +14216,7 @@
       </w:tcPr>
     </w:tblStylePr>
   </w:style>
-  <w:style w:type="table" w:styleId="ColourfulListAccent5">
+  <w:style w:type="table" w:styleId="ColorfulList-Accent5">
     <w:name w:val="Colorful List Accent 5"/>
     <w:basedOn w:val="TableNormal"/>
     <w:uiPriority w:val="72"/>
@@ -14191,7 +14295,7 @@
       </w:tcPr>
     </w:tblStylePr>
   </w:style>
-  <w:style w:type="table" w:styleId="ColourfulListAccent6">
+  <w:style w:type="table" w:styleId="ColorfulList-Accent6">
     <w:name w:val="Colorful List Accent 6"/>
     <w:basedOn w:val="TableNormal"/>
     <w:uiPriority w:val="72"/>
@@ -14270,7 +14374,7 @@
       </w:tcPr>
     </w:tblStylePr>
   </w:style>
-  <w:style w:type="table" w:styleId="ColourfulGrid">
+  <w:style w:type="table" w:styleId="ColorfulGrid">
     <w:name w:val="Colorful Grid"/>
     <w:basedOn w:val="TableNormal"/>
     <w:uiPriority w:val="73"/>
@@ -14343,7 +14447,7 @@
       </w:tcPr>
     </w:tblStylePr>
   </w:style>
-  <w:style w:type="table" w:styleId="ColourfulGridAccent1">
+  <w:style w:type="table" w:styleId="ColorfulGrid-Accent1">
     <w:name w:val="Colorful Grid Accent 1"/>
     <w:basedOn w:val="TableNormal"/>
     <w:uiPriority w:val="73"/>
@@ -14416,7 +14520,7 @@
       </w:tcPr>
     </w:tblStylePr>
   </w:style>
-  <w:style w:type="table" w:styleId="ColourfulGridAccent2">
+  <w:style w:type="table" w:styleId="ColorfulGrid-Accent2">
     <w:name w:val="Colorful Grid Accent 2"/>
     <w:basedOn w:val="TableNormal"/>
     <w:uiPriority w:val="73"/>
@@ -14489,7 +14593,7 @@
       </w:tcPr>
     </w:tblStylePr>
   </w:style>
-  <w:style w:type="table" w:styleId="ColourfulGridAccent3">
+  <w:style w:type="table" w:styleId="ColorfulGrid-Accent3">
     <w:name w:val="Colorful Grid Accent 3"/>
     <w:basedOn w:val="TableNormal"/>
     <w:uiPriority w:val="73"/>
@@ -14562,7 +14666,7 @@
       </w:tcPr>
     </w:tblStylePr>
   </w:style>
-  <w:style w:type="table" w:styleId="ColourfulGridAccent4">
+  <w:style w:type="table" w:styleId="ColorfulGrid-Accent4">
     <w:name w:val="Colorful Grid Accent 4"/>
     <w:basedOn w:val="TableNormal"/>
     <w:uiPriority w:val="73"/>
@@ -14635,7 +14739,7 @@
       </w:tcPr>
     </w:tblStylePr>
   </w:style>
-  <w:style w:type="table" w:styleId="ColourfulGridAccent5">
+  <w:style w:type="table" w:styleId="ColorfulGrid-Accent5">
     <w:name w:val="Colorful Grid Accent 5"/>
     <w:basedOn w:val="TableNormal"/>
     <w:uiPriority w:val="73"/>
@@ -14708,7 +14812,7 @@
       </w:tcPr>
     </w:tblStylePr>
   </w:style>
-  <w:style w:type="table" w:styleId="ColourfulGridAccent6">
+  <w:style w:type="table" w:styleId="ColorfulGrid-Accent6">
     <w:name w:val="Colorful Grid Accent 6"/>
     <w:basedOn w:val="TableNormal"/>
     <w:uiPriority w:val="73"/>
@@ -15135,7 +15239,6 @@
 <ds:datastoreItem xmlns:ds="http://schemas.openxmlformats.org/officeDocument/2006/customXml" ds:itemID="{EF278816-EC6F-A645-907D-7F25AECB1D4A}">
   <ds:schemaRefs>
     <ds:schemaRef ds:uri="http://schemas.openxmlformats.org/officeDocument/2006/bibliography"/>
-    <ds:schemaRef ds:uri="http://www.w3.org/2000/xmlns/"/>
   </ds:schemaRefs>
 </ds:datastoreItem>
 </file>
</xml_diff>